<commit_message>
Aire: tabla de estaciones como el informe ejemplo (con foto), gráficas en barras y resolución vigente
- Descripción de las estaciones: un bloque por estación como el informe
  ejemplo (ubicación, fechas y coordenadas; foto junto a la descripción
  del punto). Las estaciones de aire admiten foto (columna nueva en
  air_stations, migración 0007) que se sube desde la página del proyecto.
- Gráficas: todas en barras y escala lineal. Por cada tiempo de
  exposición, las concentraciones horarias u octohorarias de cada
  estación y luego los máximos diarios versus el límite, como en el
  informe ejemplo. Las variables meteorológicas también en barras.
- Resolución de acreditación de Ambienciq actualizada a la 1004 del 24
  de agosto de 2026 en las plantillas de aire, ruido y emisión.

Co-Authored-By: Claude Opus 5.5 <noreply@anthropic.com>
Claude-Session: https://claude.ai/code/session_01DhPdLpssQ5EwvnLjiqotoo
</commit_message>
<xml_diff>
--- a/templates/informe_aire_template.docx
+++ b/templates/informe_aire_template.docx
@@ -1719,6 +1719,7 @@
           <w:headerReference w:type="default" r:id="rId13"/>
           <w:footerReference w:type="default" r:id="rId14"/>
           <w:footerReference w:type="first" r:id="rId15"/>
+          <w:headerReference w:type="first" r:id="rId25"/>
           <w:pgSz w:w="12242" w:h="15842" w:code="1"/>
           <w:pgMar w:top="1418" w:right="1701" w:bottom="2268" w:left="1701" w:header="720" w:footer="227" w:gutter="0"/>
           <w:cols w:space="708"/>
@@ -8285,7 +8286,7 @@
         <w:t xml:space="preserve"> </w:t>
       </w:r>
       <w:r>
-        <w:t>la Resolución 1096 del 11 de octubre de 2024 por la cual se mantiene y modifica el alcance de la acreditación a la sociedad para producir información cuantitativa física, química y biótica; y se toman otras determinaciones.</w:t>
+        <w:t xml:space="preserve">la Resolución 1004 del 24 de agosto de 2026 por la cual se mantiene y modifica el alcance de la acreditación a la sociedad para producir información cuantitativa física, química y biótica; y se toman otras determinaciones.</w:t>
       </w:r>
       <w:r>
         <w:rPr>
@@ -8874,7 +8875,7 @@
                 <w:szCs w:val="18"/>
                 <w:lang w:val="es-ES" w:eastAsia="es-CO"/>
               </w:rPr>
-              <w:t>Resolución 1096 del 11 de octubre de 2024</w:t>
+              <w:t xml:space="preserve">Resolución 1004 del 24 de agosto de 2026</w:t>
             </w:r>
           </w:p>
         </w:tc>
@@ -22492,7 +22493,7 @@
           <w:b/>
           <w:bCs/>
         </w:rPr>
-        <w:t>Resolución No. 1096 del 11 de octubre de 2024</w:t>
+        <w:t xml:space="preserve">Resolución No. 1004 del 24 de agosto de 2026</w:t>
       </w:r>
     </w:p>
     <w:p>
@@ -40835,6 +40836,16 @@
   <w:p>
     <w:pPr>
       <w:pStyle w:val="Encabezado"/>
+    </w:pPr>
+  </w:p>
+</w:hdr>
+</file>
+
+<file path=word/header3.xml><?xml version="1.0" encoding="utf-8"?>
+<w:hdr xmlns:m="http://schemas.openxmlformats.org/officeDocument/2006/math" xmlns:mc="http://schemas.openxmlformats.org/markup-compatibility/2006" xmlns:mo="http://schemas.microsoft.com/office/mac/office/2008/main" xmlns:mv="urn:schemas-microsoft-com:mac:vml" xmlns:o="urn:schemas-microsoft-com:office:office" xmlns:r="http://schemas.openxmlformats.org/officeDocument/2006/relationships" xmlns:v="urn:schemas-microsoft-com:vml" xmlns:w10="urn:schemas-microsoft-com:office:word" xmlns:w14="http://schemas.microsoft.com/office/word/2010/wordml" xmlns:w="http://schemas.openxmlformats.org/wordprocessingml/2006/main" xmlns:wne="http://schemas.microsoft.com/office/word/2006/wordml" xmlns:wp14="http://schemas.microsoft.com/office/word/2010/wordprocessingDrawing" xmlns:wp="http://schemas.openxmlformats.org/drawingml/2006/wordprocessingDrawing" xmlns:wpc="http://schemas.microsoft.com/office/word/2010/wordprocessingCanvas" xmlns:wpg="http://schemas.microsoft.com/office/word/2010/wordprocessingGroup" xmlns:wpi="http://schemas.microsoft.com/office/word/2010/wordprocessingInk" xmlns:wps="http://schemas.microsoft.com/office/word/2010/wordprocessingShape" mc:Ignorable="w14 wp14">
+  <w:p>
+    <w:pPr>
+      <w:pStyle w:val="Header"/>
     </w:pPr>
   </w:p>
 </w:hdr>

</xml_diff>

<commit_message>
Aire: tabla de estaciones como el informe ejemplo (con foto), gráficas en barras y resolución vigente (#24)
- Descripción de las estaciones: un bloque por estación como el informe
  ejemplo (ubicación, fechas y coordenadas; foto junto a la descripción
  del punto). Las estaciones de aire admiten foto (columna nueva en
  air_stations, migración 0007) que se sube desde la página del proyecto.
- Gráficas: todas en barras y escala lineal. Por cada tiempo de
  exposición, las concentraciones horarias u octohorarias de cada
  estación y luego los máximos diarios versus el límite, como en el
  informe ejemplo. Las variables meteorológicas también en barras.
- Resolución de acreditación de Ambienciq actualizada a la 1004 del 24
  de agosto de 2026 en las plantillas de aire, ruido y emisión.


Claude-Session: https://claude.ai/code/session_01DhPdLpssQ5EwvnLjiqotoo

Co-authored-by: Claude <noreply@anthropic.com>
</commit_message>
<xml_diff>
--- a/templates/informe_aire_template.docx
+++ b/templates/informe_aire_template.docx
@@ -1719,6 +1719,7 @@
           <w:headerReference w:type="default" r:id="rId13"/>
           <w:footerReference w:type="default" r:id="rId14"/>
           <w:footerReference w:type="first" r:id="rId15"/>
+          <w:headerReference w:type="first" r:id="rId25"/>
           <w:pgSz w:w="12242" w:h="15842" w:code="1"/>
           <w:pgMar w:top="1418" w:right="1701" w:bottom="2268" w:left="1701" w:header="720" w:footer="227" w:gutter="0"/>
           <w:cols w:space="708"/>
@@ -8285,7 +8286,7 @@
         <w:t xml:space="preserve"> </w:t>
       </w:r>
       <w:r>
-        <w:t>la Resolución 1096 del 11 de octubre de 2024 por la cual se mantiene y modifica el alcance de la acreditación a la sociedad para producir información cuantitativa física, química y biótica; y se toman otras determinaciones.</w:t>
+        <w:t xml:space="preserve">la Resolución 1004 del 24 de agosto de 2026 por la cual se mantiene y modifica el alcance de la acreditación a la sociedad para producir información cuantitativa física, química y biótica; y se toman otras determinaciones.</w:t>
       </w:r>
       <w:r>
         <w:rPr>
@@ -8874,7 +8875,7 @@
                 <w:szCs w:val="18"/>
                 <w:lang w:val="es-ES" w:eastAsia="es-CO"/>
               </w:rPr>
-              <w:t>Resolución 1096 del 11 de octubre de 2024</w:t>
+              <w:t xml:space="preserve">Resolución 1004 del 24 de agosto de 2026</w:t>
             </w:r>
           </w:p>
         </w:tc>
@@ -22492,7 +22493,7 @@
           <w:b/>
           <w:bCs/>
         </w:rPr>
-        <w:t>Resolución No. 1096 del 11 de octubre de 2024</w:t>
+        <w:t xml:space="preserve">Resolución No. 1004 del 24 de agosto de 2026</w:t>
       </w:r>
     </w:p>
     <w:p>
@@ -40835,6 +40836,16 @@
   <w:p>
     <w:pPr>
       <w:pStyle w:val="Encabezado"/>
+    </w:pPr>
+  </w:p>
+</w:hdr>
+</file>
+
+<file path=word/header3.xml><?xml version="1.0" encoding="utf-8"?>
+<w:hdr xmlns:m="http://schemas.openxmlformats.org/officeDocument/2006/math" xmlns:mc="http://schemas.openxmlformats.org/markup-compatibility/2006" xmlns:mo="http://schemas.microsoft.com/office/mac/office/2008/main" xmlns:mv="urn:schemas-microsoft-com:mac:vml" xmlns:o="urn:schemas-microsoft-com:office:office" xmlns:r="http://schemas.openxmlformats.org/officeDocument/2006/relationships" xmlns:v="urn:schemas-microsoft-com:vml" xmlns:w10="urn:schemas-microsoft-com:office:word" xmlns:w14="http://schemas.microsoft.com/office/word/2010/wordml" xmlns:w="http://schemas.openxmlformats.org/wordprocessingml/2006/main" xmlns:wne="http://schemas.microsoft.com/office/word/2006/wordml" xmlns:wp14="http://schemas.microsoft.com/office/word/2010/wordprocessingDrawing" xmlns:wp="http://schemas.openxmlformats.org/drawingml/2006/wordprocessingDrawing" xmlns:wpc="http://schemas.microsoft.com/office/word/2010/wordprocessingCanvas" xmlns:wpg="http://schemas.microsoft.com/office/word/2010/wordprocessingGroup" xmlns:wpi="http://schemas.microsoft.com/office/word/2010/wordprocessingInk" xmlns:wps="http://schemas.microsoft.com/office/word/2010/wordprocessingShape" mc:Ignorable="w14 wp14">
+  <w:p>
+    <w:pPr>
+      <w:pStyle w:val="Header"/>
     </w:pPr>
   </w:p>
 </w:hdr>

</xml_diff>